<commit_message>
Remove private reference PDF from release
</commit_message>
<xml_diff>
--- a/docs/工程说明文档-轮腿嵌入式控制系统.docx
+++ b/docs/工程说明文档-轮腿嵌入式控制系统.docx
@@ -63,7 +63,7 @@
           <w:rFonts w:ascii="Microsoft YaHei" w:hAnsi="Microsoft YaHei" w:eastAsia="Microsoft YaHei"/>
           <w:sz w:val="21"/>
         </w:rPr>
-        <w:t>参考材料：本仓库源码、DJI RM AWARD 2026 申请材料（南京航空航天大学金城学院-周勇宇-嵌入式）、ST/Arm/FreeRTOS 官方资料与公开控制理论资料。</w:t>
+        <w:t>参考来源：本仓库源码、队内历史测试记录、ST/Arm/FreeRTOS 官方资料与公开控制理论资料。</w:t>
       </w:r>
     </w:p>
     <w:p>
@@ -99,7 +99,7 @@
           <w:rFonts w:ascii="Microsoft YaHei" w:hAnsi="Microsoft YaHei" w:eastAsia="Microsoft YaHei"/>
           <w:sz w:val="21"/>
         </w:rPr>
-        <w:t>文档按评审评分项组织，既说明当前仓库中已经落地的源码实现，也把 PDF 中记录但当前源码未完全展开的方向标为“技术参考/后续补齐项”，避免把规划内容写成已完成实现。</w:t>
+        <w:t>文档按评审评分项组织，既说明当前仓库中已经落地的源码实现，也把 内部技术记录中提到但当前源码未完全展开的方向标为“技术参考/后续补齐项”，避免把规划内容写成已完成实现。</w:t>
       </w:r>
     </w:p>
     <w:p>
@@ -613,7 +613,7 @@
           <w:rFonts w:ascii="Microsoft YaHei" w:hAnsi="Microsoft YaHei" w:eastAsia="Microsoft YaHei"/>
           <w:sz w:val="21"/>
         </w:rPr>
-        <w:t>以下指标来自 DJI RM AWARD 2026 申请材料中的历史实机记录，可作为本工程可靠性与运行效果的阶段性证据。</w:t>
+        <w:t>以下指标来自队内历史实机记录，可作为本工程可靠性与运行效果的阶段性证据。</w:t>
       </w:r>
     </w:p>
     <w:tbl>
@@ -3799,7 +3799,7 @@
           <w:rFonts w:ascii="Microsoft YaHei" w:hAnsi="Microsoft YaHei" w:eastAsia="Microsoft YaHei"/>
           <w:sz w:val="21"/>
         </w:rPr>
-        <w:t>说明：PDF 中提到的无人机云台 Yaw 分区软限位属于重要技术参考。当前源码中可以看到 Pitch 目标限位和绝对 Yaw 回零/自救逻辑，未在现有仓库中确认完整的 Yaw 分区软限位实现，因此本文把它列为后续可补齐项，而非当前完整实现。</w:t>
+        <w:t>说明：内部技术记录中提到的无人机云台 Yaw 分区软限位属于重要技术参考。当前源码中可以看到 Pitch 目标限位和绝对 Yaw 回零/自救逻辑，未在现有仓库中确认完整的 Yaw 分区软限位实现，因此本文把它列为后续可补齐项，而非当前完整实现。</w:t>
       </w:r>
     </w:p>
     <w:p>
@@ -4335,7 +4335,7 @@
                 <w:b w:val="0"/>
                 <w:sz w:val="17"/>
               </w:rPr>
-              <w:t>DJI RM AWARD 2026 申请材料</w:t>
+              <w:t>队内历史测试记录</w:t>
             </w:r>
           </w:p>
         </w:tc>
@@ -4352,7 +4352,7 @@
                 <w:b w:val="0"/>
                 <w:sz w:val="17"/>
               </w:rPr>
-              <w:t>本地 PDF 文件</w:t>
+              <w:t>不随仓库发布</w:t>
             </w:r>
           </w:p>
         </w:tc>
@@ -5135,7 +5135,7 @@
           <w:rFonts w:ascii="Microsoft YaHei" w:hAnsi="Microsoft YaHei" w:eastAsia="Microsoft YaHei"/>
           <w:sz w:val="20"/>
         </w:rPr>
-        <w:t>将 PDF 中的无人机云台 Yaw 分区软限位整理为源码级实现或独立示例，并补充边界状态测试。</w:t>
+        <w:t>将内部技术记录中的无人机云台 Yaw 分区软限位整理为源码级实现或独立示例，并补充边界状态测试。</w:t>
       </w:r>
     </w:p>
     <w:p>
@@ -5475,7 +5475,7 @@
                 <w:b w:val="0"/>
                 <w:sz w:val="17"/>
               </w:rPr>
-              <w:t>Check_Task、ERO、链路检测、打滑、卡腿、离地和倒地自救构成安全链路；PDF 记录了实机效果</w:t>
+              <w:t>Check_Task、ERO、链路检测、打滑、卡腿、离地和倒地自救构成安全链路；历史测试记录提供了实机效果依据</w:t>
             </w:r>
           </w:p>
         </w:tc>

</xml_diff>